<commit_message>
140 Styles-PDF: nytt namn Gemini Notebook 140 Styles
Titel, rubrik, ingress, sidfot och Word-version. Samma 67 sidor,
fortfarande olänkad. Stilpromptens "NotebookLM/product-guide style"
står kvar med avsikt.

Co-Authored-By: Claude Opus 5.5 <noreply@anthropic.com>
</commit_message>
<xml_diff>
--- a/exports/nlm-140-prompts-en.docx
+++ b/exports/nlm-140-prompts-en.docx
@@ -12,7 +12,7 @@
           <w:color w:val="C8A86B"/>
           <w:sz w:val="20"/>
         </w:rPr>
-        <w:t>NotebookLM Style Library</w:t>
+        <w:t>Gemini Notebook Style Library</w:t>
       </w:r>
     </w:p>
     <w:p>
@@ -38,7 +38,7 @@
     <w:p/>
     <w:p>
       <w:r>
-        <w:t>This document collects all 140 art-direction prompts that produce the NotebookLM infographic styles on choosewise.education. Each prompt is numbered to match the original Swedish library and can be pasted directly into NotebookLM, Midjourney, Flux, or any other image generator that accepts long-form directives.</w:t>
+        <w:t>This document collects all 140 art-direction prompts that produce the Gemini Notebook infographic styles on choosewise.education. Each prompt is numbered to match the original Swedish library and can be pasted directly into Gemini Notebook, Midjourney, Flux, or any other image generator that accepts long-form directives.</w:t>
       </w:r>
     </w:p>
     <w:p/>

</xml_diff>